<commit_message>
Document GRBL settings wizard
</commit_message>
<xml_diff>
--- a/docs/CNCjs_Pendant_User_Manual.docx
+++ b/docs/CNCjs_Pendant_User_Manual.docx
@@ -675,6 +675,929 @@
           <w:sz w:val="22"/>
         </w:rPr>
         <w:t>Start the job and watch the first pass closely.</w:t>
+      </w:r>
+    </w:p>
+    <w:p>
+      <w:pPr>
+        <w:pStyle w:val="Heading2"/>
+      </w:pPr>
+      <w:r>
+        <w:rPr>
+          <w:rFonts w:ascii="Calibri" w:hAnsi="Calibri"/>
+          <w:color w:val="2E74B5"/>
+          <w:sz w:val="26"/>
+        </w:rPr>
+        <w:t>User Startup Guide</w:t>
+      </w:r>
+    </w:p>
+    <w:p>
+      <w:pPr>
+        <w:keepLines/>
+        <w:spacing w:before="0" w:after="120" w:line="300" w:lineRule="auto"/>
+      </w:pPr>
+      <w:r>
+        <w:rPr>
+          <w:rFonts w:ascii="Calibri" w:hAnsi="Calibri"/>
+          <w:color w:val="000000"/>
+          <w:sz w:val="22"/>
+        </w:rPr>
+        <w:t>Use this section as the normal daily startup procedure. It is written for a user who just walked up to the machine and wants to get CNCjs, the pendant, and the router ready without guessing what comes next.</w:t>
+      </w:r>
+    </w:p>
+    <w:p>
+      <w:pPr>
+        <w:pStyle w:val="Heading3"/>
+      </w:pPr>
+      <w:r>
+        <w:rPr>
+          <w:rFonts w:ascii="Calibri" w:hAnsi="Calibri"/>
+          <w:color w:val="1F4D78"/>
+          <w:sz w:val="24"/>
+        </w:rPr>
+        <w:t>1. Start with the machine safe</w:t>
+      </w:r>
+    </w:p>
+    <w:p>
+      <w:pPr>
+        <w:pStyle w:val="ListNumber"/>
+      </w:pPr>
+      <w:r>
+        <w:rPr>
+          <w:rFonts w:ascii="Calibri" w:hAnsi="Calibri"/>
+          <w:color w:val="000000"/>
+          <w:sz w:val="22"/>
+        </w:rPr>
+        <w:t>Make sure the router/spindle is off.</w:t>
+      </w:r>
+    </w:p>
+    <w:p>
+      <w:pPr>
+        <w:pStyle w:val="ListNumber"/>
+      </w:pPr>
+      <w:r>
+        <w:rPr>
+          <w:rFonts w:ascii="Calibri" w:hAnsi="Calibri"/>
+          <w:color w:val="000000"/>
+          <w:sz w:val="22"/>
+        </w:rPr>
+        <w:t>Make sure the emergency stop is released but easy to reach.</w:t>
+      </w:r>
+    </w:p>
+    <w:p>
+      <w:pPr>
+        <w:pStyle w:val="ListNumber"/>
+      </w:pPr>
+      <w:r>
+        <w:rPr>
+          <w:rFonts w:ascii="Calibri" w:hAnsi="Calibri"/>
+          <w:color w:val="000000"/>
+          <w:sz w:val="22"/>
+        </w:rPr>
+        <w:t>Clear loose tools, screws, wrenches, and offcuts from the table.</w:t>
+      </w:r>
+    </w:p>
+    <w:p>
+      <w:pPr>
+        <w:pStyle w:val="ListNumber"/>
+      </w:pPr>
+      <w:r>
+        <w:rPr>
+          <w:rFonts w:ascii="Calibri" w:hAnsi="Calibri"/>
+          <w:color w:val="000000"/>
+          <w:sz w:val="22"/>
+        </w:rPr>
+        <w:t>Check that the tool is tight in the collet.</w:t>
+      </w:r>
+    </w:p>
+    <w:p>
+      <w:pPr>
+        <w:pStyle w:val="ListNumber"/>
+      </w:pPr>
+      <w:r>
+        <w:rPr>
+          <w:rFonts w:ascii="Calibri" w:hAnsi="Calibri"/>
+          <w:color w:val="000000"/>
+          <w:sz w:val="22"/>
+        </w:rPr>
+        <w:t>Move the probe cable so it cannot catch on the gantry.</w:t>
+      </w:r>
+    </w:p>
+    <w:p>
+      <w:pPr>
+        <w:pStyle w:val="Heading3"/>
+      </w:pPr>
+      <w:r>
+        <w:rPr>
+          <w:rFonts w:ascii="Calibri" w:hAnsi="Calibri"/>
+          <w:color w:val="1F4D78"/>
+          <w:sz w:val="24"/>
+        </w:rPr>
+        <w:t>2. Power the controller and computer</w:t>
+      </w:r>
+    </w:p>
+    <w:p>
+      <w:pPr>
+        <w:pStyle w:val="ListNumber"/>
+      </w:pPr>
+      <w:r>
+        <w:rPr>
+          <w:rFonts w:ascii="Calibri" w:hAnsi="Calibri"/>
+          <w:color w:val="000000"/>
+          <w:sz w:val="22"/>
+        </w:rPr>
+        <w:t>Turn on the CNC controller power.</w:t>
+      </w:r>
+    </w:p>
+    <w:p>
+      <w:pPr>
+        <w:pStyle w:val="ListNumber"/>
+      </w:pPr>
+      <w:r>
+        <w:rPr>
+          <w:rFonts w:ascii="Calibri" w:hAnsi="Calibri"/>
+          <w:color w:val="000000"/>
+          <w:sz w:val="22"/>
+        </w:rPr>
+        <w:t>Connect the USB cable between the MKS DLC V2 and the CNCjs computer.</w:t>
+      </w:r>
+    </w:p>
+    <w:p>
+      <w:pPr>
+        <w:pStyle w:val="ListNumber"/>
+      </w:pPr>
+      <w:r>
+        <w:rPr>
+          <w:rFonts w:ascii="Calibri" w:hAnsi="Calibri"/>
+          <w:color w:val="000000"/>
+          <w:sz w:val="22"/>
+        </w:rPr>
+        <w:t>Turn on the CNCjs computer if it is not already running.</w:t>
+      </w:r>
+    </w:p>
+    <w:p>
+      <w:pPr>
+        <w:pStyle w:val="ListNumber"/>
+      </w:pPr>
+      <w:r>
+        <w:rPr>
+          <w:rFonts w:ascii="Calibri" w:hAnsi="Calibri"/>
+          <w:color w:val="000000"/>
+          <w:sz w:val="22"/>
+        </w:rPr>
+        <w:t>Wait a few seconds for Windows to see the serial port.</w:t>
+      </w:r>
+    </w:p>
+    <w:p>
+      <w:pPr>
+        <w:pStyle w:val="Heading3"/>
+      </w:pPr>
+      <w:r>
+        <w:rPr>
+          <w:rFonts w:ascii="Calibri" w:hAnsi="Calibri"/>
+          <w:color w:val="1F4D78"/>
+          <w:sz w:val="24"/>
+        </w:rPr>
+        <w:t>3. Launch CNCjs</w:t>
+      </w:r>
+    </w:p>
+    <w:p>
+      <w:pPr>
+        <w:pStyle w:val="ListNumber"/>
+      </w:pPr>
+      <w:r>
+        <w:rPr>
+          <w:rFonts w:ascii="Calibri" w:hAnsi="Calibri"/>
+          <w:color w:val="000000"/>
+          <w:sz w:val="22"/>
+        </w:rPr>
+        <w:t xml:space="preserve">Double-click </w:t>
+      </w:r>
+      <w:r>
+        <w:rPr>
+          <w:rFonts w:ascii="Consolas" w:hAnsi="Consolas"/>
+          <w:color w:val="1C232B"/>
+          <w:sz w:val="21"/>
+        </w:rPr>
+        <w:t>Launch CNCjs Dev.bat</w:t>
+      </w:r>
+      <w:r>
+        <w:rPr>
+          <w:rFonts w:ascii="Calibri" w:hAnsi="Calibri"/>
+          <w:color w:val="000000"/>
+          <w:sz w:val="22"/>
+        </w:rPr>
+        <w:t>.</w:t>
+      </w:r>
+    </w:p>
+    <w:p>
+      <w:pPr>
+        <w:pStyle w:val="ListNumber"/>
+      </w:pPr>
+      <w:r>
+        <w:rPr>
+          <w:rFonts w:ascii="Calibri" w:hAnsi="Calibri"/>
+          <w:color w:val="000000"/>
+          <w:sz w:val="22"/>
+        </w:rPr>
+        <w:t>Leave the server window open.</w:t>
+      </w:r>
+    </w:p>
+    <w:p>
+      <w:pPr>
+        <w:pStyle w:val="ListNumber"/>
+      </w:pPr>
+      <w:r>
+        <w:rPr>
+          <w:rFonts w:ascii="Calibri" w:hAnsi="Calibri"/>
+          <w:color w:val="000000"/>
+          <w:sz w:val="22"/>
+        </w:rPr>
+        <w:t xml:space="preserve">Open the desktop workspace at </w:t>
+      </w:r>
+      <w:r>
+        <w:rPr>
+          <w:rFonts w:ascii="Consolas" w:hAnsi="Consolas"/>
+          <w:color w:val="1C232B"/>
+          <w:sz w:val="21"/>
+        </w:rPr>
+        <w:t>http://localhost:8080</w:t>
+      </w:r>
+      <w:r>
+        <w:rPr>
+          <w:rFonts w:ascii="Calibri" w:hAnsi="Calibri"/>
+          <w:color w:val="000000"/>
+          <w:sz w:val="22"/>
+        </w:rPr>
+        <w:t>.</w:t>
+      </w:r>
+    </w:p>
+    <w:p>
+      <w:pPr>
+        <w:pStyle w:val="ListNumber"/>
+      </w:pPr>
+      <w:r>
+        <w:rPr>
+          <w:rFonts w:ascii="Calibri" w:hAnsi="Calibri"/>
+          <w:color w:val="000000"/>
+          <w:sz w:val="22"/>
+        </w:rPr>
+        <w:t>Note the network IP printed by CNCjs if you want to use the phone pendant.</w:t>
+      </w:r>
+    </w:p>
+    <w:p>
+      <w:pPr>
+        <w:pStyle w:val="Heading3"/>
+      </w:pPr>
+      <w:r>
+        <w:rPr>
+          <w:rFonts w:ascii="Calibri" w:hAnsi="Calibri"/>
+          <w:color w:val="1F4D78"/>
+          <w:sz w:val="24"/>
+        </w:rPr>
+        <w:t>4. Open the phone pendant</w:t>
+      </w:r>
+    </w:p>
+    <w:p>
+      <w:pPr>
+        <w:pStyle w:val="ListNumber"/>
+      </w:pPr>
+      <w:r>
+        <w:rPr>
+          <w:rFonts w:ascii="Calibri" w:hAnsi="Calibri"/>
+          <w:color w:val="000000"/>
+          <w:sz w:val="22"/>
+        </w:rPr>
+        <w:t>Connect the phone to the same Wi-Fi network as the CNCjs computer.</w:t>
+      </w:r>
+    </w:p>
+    <w:p>
+      <w:pPr>
+        <w:pStyle w:val="ListNumber"/>
+      </w:pPr>
+      <w:r>
+        <w:rPr>
+          <w:rFonts w:ascii="Calibri" w:hAnsi="Calibri"/>
+          <w:color w:val="000000"/>
+          <w:sz w:val="22"/>
+        </w:rPr>
+        <w:t xml:space="preserve">Open </w:t>
+      </w:r>
+      <w:r>
+        <w:rPr>
+          <w:rFonts w:ascii="Consolas" w:hAnsi="Consolas"/>
+          <w:color w:val="1C232B"/>
+          <w:sz w:val="21"/>
+        </w:rPr>
+        <w:t>http://&lt;computer-ip&gt;:8000/pendant/</w:t>
+      </w:r>
+      <w:r>
+        <w:rPr>
+          <w:rFonts w:ascii="Calibri" w:hAnsi="Calibri"/>
+          <w:color w:val="000000"/>
+          <w:sz w:val="22"/>
+        </w:rPr>
+        <w:t>.</w:t>
+      </w:r>
+    </w:p>
+    <w:p>
+      <w:pPr>
+        <w:pStyle w:val="ListNumber"/>
+      </w:pPr>
+      <w:r>
+        <w:rPr>
+          <w:rFonts w:ascii="Calibri" w:hAnsi="Calibri"/>
+          <w:color w:val="000000"/>
+          <w:sz w:val="22"/>
+        </w:rPr>
+        <w:t>Keep the phone screen awake while you are jogging or probing.</w:t>
+      </w:r>
+    </w:p>
+    <w:p>
+      <w:pPr>
+        <w:pStyle w:val="ListNumber"/>
+      </w:pPr>
+      <w:r>
+        <w:rPr>
+          <w:rFonts w:ascii="Calibri" w:hAnsi="Calibri"/>
+          <w:color w:val="000000"/>
+          <w:sz w:val="22"/>
+        </w:rPr>
+        <w:t>Use the pendant only while you can see the machine.</w:t>
+      </w:r>
+    </w:p>
+    <w:p>
+      <w:pPr>
+        <w:pStyle w:val="Heading3"/>
+      </w:pPr>
+      <w:r>
+        <w:rPr>
+          <w:rFonts w:ascii="Calibri" w:hAnsi="Calibri"/>
+          <w:color w:val="1F4D78"/>
+          <w:sz w:val="24"/>
+        </w:rPr>
+        <w:t>5. Connect GRBL</w:t>
+      </w:r>
+    </w:p>
+    <w:p>
+      <w:pPr>
+        <w:pStyle w:val="ListNumber"/>
+      </w:pPr>
+      <w:r>
+        <w:rPr>
+          <w:rFonts w:ascii="Calibri" w:hAnsi="Calibri"/>
+          <w:color w:val="000000"/>
+          <w:sz w:val="22"/>
+        </w:rPr>
+        <w:t>In the desktop workspace, select the controller serial port.</w:t>
+      </w:r>
+    </w:p>
+    <w:p>
+      <w:pPr>
+        <w:pStyle w:val="ListNumber"/>
+      </w:pPr>
+      <w:r>
+        <w:rPr>
+          <w:rFonts w:ascii="Calibri" w:hAnsi="Calibri"/>
+          <w:color w:val="000000"/>
+          <w:sz w:val="22"/>
+        </w:rPr>
+        <w:t>Use the GRBL controller option.</w:t>
+      </w:r>
+    </w:p>
+    <w:p>
+      <w:pPr>
+        <w:pStyle w:val="ListNumber"/>
+      </w:pPr>
+      <w:r>
+        <w:rPr>
+          <w:rFonts w:ascii="Calibri" w:hAnsi="Calibri"/>
+          <w:color w:val="000000"/>
+          <w:sz w:val="22"/>
+        </w:rPr>
+        <w:t xml:space="preserve">Use </w:t>
+      </w:r>
+      <w:r>
+        <w:rPr>
+          <w:rFonts w:ascii="Consolas" w:hAnsi="Consolas"/>
+          <w:color w:val="1C232B"/>
+          <w:sz w:val="21"/>
+        </w:rPr>
+        <w:t>115200</w:t>
+      </w:r>
+      <w:r>
+        <w:rPr>
+          <w:rFonts w:ascii="Calibri" w:hAnsi="Calibri"/>
+          <w:color w:val="000000"/>
+          <w:sz w:val="22"/>
+        </w:rPr>
+        <w:t xml:space="preserve"> baud unless your machine is configured differently.</w:t>
+      </w:r>
+    </w:p>
+    <w:p>
+      <w:pPr>
+        <w:pStyle w:val="ListNumber"/>
+      </w:pPr>
+      <w:r>
+        <w:rPr>
+          <w:rFonts w:ascii="Calibri" w:hAnsi="Calibri"/>
+          <w:color w:val="000000"/>
+          <w:sz w:val="22"/>
+        </w:rPr>
+        <w:t>Click Open.</w:t>
+      </w:r>
+    </w:p>
+    <w:p>
+      <w:pPr>
+        <w:pStyle w:val="ListNumber"/>
+      </w:pPr>
+      <w:r>
+        <w:rPr>
+          <w:rFonts w:ascii="Calibri" w:hAnsi="Calibri"/>
+          <w:color w:val="000000"/>
+          <w:sz w:val="22"/>
+        </w:rPr>
+        <w:t>Confirm CNCjs shows a real machine state such as Idle or Alarm.</w:t>
+      </w:r>
+    </w:p>
+    <w:p>
+      <w:pPr>
+        <w:pStyle w:val="Heading3"/>
+      </w:pPr>
+      <w:r>
+        <w:rPr>
+          <w:rFonts w:ascii="Calibri" w:hAnsi="Calibri"/>
+          <w:color w:val="1F4D78"/>
+          <w:sz w:val="24"/>
+        </w:rPr>
+        <w:t>6. Unlock and home</w:t>
+      </w:r>
+    </w:p>
+    <w:p>
+      <w:pPr>
+        <w:pStyle w:val="ListNumber"/>
+      </w:pPr>
+      <w:r>
+        <w:rPr>
+          <w:rFonts w:ascii="Calibri" w:hAnsi="Calibri"/>
+          <w:color w:val="000000"/>
+          <w:sz w:val="22"/>
+        </w:rPr>
+        <w:t>If GRBL starts in Alarm, inspect the machine before unlocking.</w:t>
+      </w:r>
+    </w:p>
+    <w:p>
+      <w:pPr>
+        <w:pStyle w:val="ListNumber"/>
+      </w:pPr>
+      <w:r>
+        <w:rPr>
+          <w:rFonts w:ascii="Calibri" w:hAnsi="Calibri"/>
+          <w:color w:val="000000"/>
+          <w:sz w:val="22"/>
+        </w:rPr>
+        <w:t>Press Unlock only when the machine is physically clear.</w:t>
+      </w:r>
+    </w:p>
+    <w:p>
+      <w:pPr>
+        <w:pStyle w:val="ListNumber"/>
+      </w:pPr>
+      <w:r>
+        <w:rPr>
+          <w:rFonts w:ascii="Calibri" w:hAnsi="Calibri"/>
+          <w:color w:val="000000"/>
+          <w:sz w:val="22"/>
+        </w:rPr>
+        <w:t>Press Home Machine if your limits and homing are configured.</w:t>
+      </w:r>
+    </w:p>
+    <w:p>
+      <w:pPr>
+        <w:pStyle w:val="ListNumber"/>
+      </w:pPr>
+      <w:r>
+        <w:rPr>
+          <w:rFonts w:ascii="Calibri" w:hAnsi="Calibri"/>
+          <w:color w:val="000000"/>
+          <w:sz w:val="22"/>
+        </w:rPr>
+        <w:t>Use Home X, Home Y, or Home Z only if your firmware supports individual axis homing.</w:t>
+      </w:r>
+    </w:p>
+    <w:p>
+      <w:pPr>
+        <w:pStyle w:val="Heading3"/>
+      </w:pPr>
+      <w:r>
+        <w:rPr>
+          <w:rFonts w:ascii="Calibri" w:hAnsi="Calibri"/>
+          <w:color w:val="1F4D78"/>
+          <w:sz w:val="24"/>
+        </w:rPr>
+        <w:t>7. Jog test before setup</w:t>
+      </w:r>
+    </w:p>
+    <w:p>
+      <w:pPr>
+        <w:pStyle w:val="ListNumber"/>
+      </w:pPr>
+      <w:r>
+        <w:rPr>
+          <w:rFonts w:ascii="Calibri" w:hAnsi="Calibri"/>
+          <w:color w:val="000000"/>
+          <w:sz w:val="22"/>
+        </w:rPr>
+        <w:t>Select a small jog step.</w:t>
+      </w:r>
+    </w:p>
+    <w:p>
+      <w:pPr>
+        <w:pStyle w:val="ListNumber"/>
+      </w:pPr>
+      <w:r>
+        <w:rPr>
+          <w:rFonts w:ascii="Calibri" w:hAnsi="Calibri"/>
+          <w:color w:val="000000"/>
+          <w:sz w:val="22"/>
+        </w:rPr>
+        <w:t>Jog X a short distance and confirm the machine moves the expected way.</w:t>
+      </w:r>
+    </w:p>
+    <w:p>
+      <w:pPr>
+        <w:pStyle w:val="ListNumber"/>
+      </w:pPr>
+      <w:r>
+        <w:rPr>
+          <w:rFonts w:ascii="Calibri" w:hAnsi="Calibri"/>
+          <w:color w:val="000000"/>
+          <w:sz w:val="22"/>
+        </w:rPr>
+        <w:t>Jog Y a short distance and confirm the machine moves the expected way.</w:t>
+      </w:r>
+    </w:p>
+    <w:p>
+      <w:pPr>
+        <w:pStyle w:val="ListNumber"/>
+      </w:pPr>
+      <w:r>
+        <w:rPr>
+          <w:rFonts w:ascii="Calibri" w:hAnsi="Calibri"/>
+          <w:color w:val="000000"/>
+          <w:sz w:val="22"/>
+        </w:rPr>
+        <w:t>Jog Z up before any larger X/Y move.</w:t>
+      </w:r>
+    </w:p>
+    <w:p>
+      <w:pPr>
+        <w:pStyle w:val="ListNumber"/>
+      </w:pPr>
+      <w:r>
+        <w:rPr>
+          <w:rFonts w:ascii="Calibri" w:hAnsi="Calibri"/>
+          <w:color w:val="000000"/>
+          <w:sz w:val="22"/>
+        </w:rPr>
+        <w:t>Stop and fix the setup if any axis direction feels wrong.</w:t>
+      </w:r>
+    </w:p>
+    <w:p>
+      <w:pPr>
+        <w:pStyle w:val="Heading3"/>
+      </w:pPr>
+      <w:r>
+        <w:rPr>
+          <w:rFonts w:ascii="Calibri" w:hAnsi="Calibri"/>
+          <w:color w:val="1F4D78"/>
+          <w:sz w:val="24"/>
+        </w:rPr>
+        <w:t>8. Prepare the workpiece</w:t>
+      </w:r>
+    </w:p>
+    <w:p>
+      <w:pPr>
+        <w:pStyle w:val="ListNumber"/>
+      </w:pPr>
+      <w:r>
+        <w:rPr>
+          <w:rFonts w:ascii="Calibri" w:hAnsi="Calibri"/>
+          <w:color w:val="000000"/>
+          <w:sz w:val="22"/>
+        </w:rPr>
+        <w:t>Clamp the stock firmly.</w:t>
+      </w:r>
+    </w:p>
+    <w:p>
+      <w:pPr>
+        <w:pStyle w:val="ListNumber"/>
+      </w:pPr>
+      <w:r>
+        <w:rPr>
+          <w:rFonts w:ascii="Calibri" w:hAnsi="Calibri"/>
+          <w:color w:val="000000"/>
+          <w:sz w:val="22"/>
+        </w:rPr>
+        <w:t>Confirm clamps are outside the expected toolpath.</w:t>
+      </w:r>
+    </w:p>
+    <w:p>
+      <w:pPr>
+        <w:pStyle w:val="ListNumber"/>
+      </w:pPr>
+      <w:r>
+        <w:rPr>
+          <w:rFonts w:ascii="Calibri" w:hAnsi="Calibri"/>
+          <w:color w:val="000000"/>
+          <w:sz w:val="22"/>
+        </w:rPr>
+        <w:t>Install the correct tool for the CAM file.</w:t>
+      </w:r>
+    </w:p>
+    <w:p>
+      <w:pPr>
+        <w:pStyle w:val="ListNumber"/>
+      </w:pPr>
+      <w:r>
+        <w:rPr>
+          <w:rFonts w:ascii="Calibri" w:hAnsi="Calibri"/>
+          <w:color w:val="000000"/>
+          <w:sz w:val="22"/>
+        </w:rPr>
+        <w:t>Attach the probe if you will use probing.</w:t>
+      </w:r>
+    </w:p>
+    <w:p>
+      <w:pPr>
+        <w:pStyle w:val="ListNumber"/>
+      </w:pPr>
+      <w:r>
+        <w:rPr>
+          <w:rFonts w:ascii="Calibri" w:hAnsi="Calibri"/>
+          <w:color w:val="000000"/>
+          <w:sz w:val="22"/>
+        </w:rPr>
+        <w:t>Confirm the probe triggers before sending a probing move.</w:t>
+      </w:r>
+    </w:p>
+    <w:p>
+      <w:pPr>
+        <w:pStyle w:val="Heading3"/>
+      </w:pPr>
+      <w:r>
+        <w:rPr>
+          <w:rFonts w:ascii="Calibri" w:hAnsi="Calibri"/>
+          <w:color w:val="1F4D78"/>
+          <w:sz w:val="24"/>
+        </w:rPr>
+        <w:t>9. Set the work zero</w:t>
+      </w:r>
+    </w:p>
+    <w:p>
+      <w:pPr>
+        <w:pStyle w:val="ListNumber"/>
+      </w:pPr>
+      <w:r>
+        <w:rPr>
+          <w:rFonts w:ascii="Calibri" w:hAnsi="Calibri"/>
+          <w:color w:val="000000"/>
+          <w:sz w:val="22"/>
+        </w:rPr>
+        <w:t>Confirm the active WCS is G54 unless you intentionally use another WCS.</w:t>
+      </w:r>
+    </w:p>
+    <w:p>
+      <w:pPr>
+        <w:pStyle w:val="ListNumber"/>
+      </w:pPr>
+      <w:r>
+        <w:rPr>
+          <w:rFonts w:ascii="Calibri" w:hAnsi="Calibri"/>
+          <w:color w:val="000000"/>
+          <w:sz w:val="22"/>
+        </w:rPr>
+        <w:t>Use Z probe for the top surface.</w:t>
+      </w:r>
+    </w:p>
+    <w:p>
+      <w:pPr>
+        <w:pStyle w:val="ListNumber"/>
+      </w:pPr>
+      <w:r>
+        <w:rPr>
+          <w:rFonts w:ascii="Calibri" w:hAnsi="Calibri"/>
+          <w:color w:val="000000"/>
+          <w:sz w:val="22"/>
+        </w:rPr>
+        <w:t>Use the square probing pad for an edge or corner.</w:t>
+      </w:r>
+    </w:p>
+    <w:p>
+      <w:pPr>
+        <w:pStyle w:val="ListNumber"/>
+      </w:pPr>
+      <w:r>
+        <w:rPr>
+          <w:rFonts w:ascii="Calibri" w:hAnsi="Calibri"/>
+          <w:color w:val="000000"/>
+          <w:sz w:val="22"/>
+        </w:rPr>
+        <w:t>Confirm the DRO reads X0, Y0, and Z0 where you expect the job origin.</w:t>
+      </w:r>
+    </w:p>
+    <w:p>
+      <w:pPr>
+        <w:pStyle w:val="ListNumber"/>
+      </w:pPr>
+      <w:r>
+        <w:rPr>
+          <w:rFonts w:ascii="Calibri" w:hAnsi="Calibri"/>
+          <w:color w:val="000000"/>
+          <w:sz w:val="22"/>
+        </w:rPr>
+        <w:t>Retract Z to a safe height before loading or starting a job.</w:t>
+      </w:r>
+    </w:p>
+    <w:p>
+      <w:pPr>
+        <w:pStyle w:val="Heading3"/>
+      </w:pPr>
+      <w:r>
+        <w:rPr>
+          <w:rFonts w:ascii="Calibri" w:hAnsi="Calibri"/>
+          <w:color w:val="1F4D78"/>
+          <w:sz w:val="24"/>
+        </w:rPr>
+        <w:t>10. Load and run the first motion carefully</w:t>
+      </w:r>
+    </w:p>
+    <w:p>
+      <w:pPr>
+        <w:pStyle w:val="ListNumber"/>
+      </w:pPr>
+      <w:r>
+        <w:rPr>
+          <w:rFonts w:ascii="Calibri" w:hAnsi="Calibri"/>
+          <w:color w:val="000000"/>
+          <w:sz w:val="22"/>
+        </w:rPr>
+        <w:t>Load the G-code file.</w:t>
+      </w:r>
+    </w:p>
+    <w:p>
+      <w:pPr>
+        <w:pStyle w:val="ListNumber"/>
+      </w:pPr>
+      <w:r>
+        <w:rPr>
+          <w:rFonts w:ascii="Calibri" w:hAnsi="Calibri"/>
+          <w:color w:val="000000"/>
+          <w:sz w:val="22"/>
+        </w:rPr>
+        <w:t>Inspect the Visualizer before pressing Start.</w:t>
+      </w:r>
+    </w:p>
+    <w:p>
+      <w:pPr>
+        <w:pStyle w:val="ListNumber"/>
+      </w:pPr>
+      <w:r>
+        <w:rPr>
+          <w:rFonts w:ascii="Calibri" w:hAnsi="Calibri"/>
+          <w:color w:val="000000"/>
+          <w:sz w:val="22"/>
+        </w:rPr>
+        <w:t>Check that the job extents fit inside the stock.</w:t>
+      </w:r>
+    </w:p>
+    <w:p>
+      <w:pPr>
+        <w:pStyle w:val="ListNumber"/>
+      </w:pPr>
+      <w:r>
+        <w:rPr>
+          <w:rFonts w:ascii="Calibri" w:hAnsi="Calibri"/>
+          <w:color w:val="000000"/>
+          <w:sz w:val="22"/>
+        </w:rPr>
+        <w:t>Start with the router/spindle off for an air cut if this setup is new.</w:t>
+      </w:r>
+    </w:p>
+    <w:p>
+      <w:pPr>
+        <w:pStyle w:val="ListNumber"/>
+      </w:pPr>
+      <w:r>
+        <w:rPr>
+          <w:rFonts w:ascii="Calibri" w:hAnsi="Calibri"/>
+          <w:color w:val="000000"/>
+          <w:sz w:val="22"/>
+        </w:rPr>
+        <w:t>When you are ready to cut, start the router/spindle and begin the job.</w:t>
+      </w:r>
+    </w:p>
+    <w:p>
+      <w:pPr>
+        <w:pStyle w:val="ListNumber"/>
+      </w:pPr>
+      <w:r>
+        <w:rPr>
+          <w:rFonts w:ascii="Calibri" w:hAnsi="Calibri"/>
+          <w:color w:val="000000"/>
+          <w:sz w:val="22"/>
+        </w:rPr>
+        <w:t>Watch the first plunge and first pass closely.</w:t>
+      </w:r>
+    </w:p>
+    <w:p>
+      <w:pPr>
+        <w:pStyle w:val="Heading3"/>
+      </w:pPr>
+      <w:r>
+        <w:rPr>
+          <w:rFonts w:ascii="Calibri" w:hAnsi="Calibri"/>
+          <w:color w:val="1F4D78"/>
+          <w:sz w:val="24"/>
+        </w:rPr>
+        <w:t>11. Shutdown after a job</w:t>
+      </w:r>
+    </w:p>
+    <w:p>
+      <w:pPr>
+        <w:pStyle w:val="ListNumber"/>
+      </w:pPr>
+      <w:r>
+        <w:rPr>
+          <w:rFonts w:ascii="Calibri" w:hAnsi="Calibri"/>
+          <w:color w:val="000000"/>
+          <w:sz w:val="22"/>
+        </w:rPr>
+        <w:t>Wait for all motion to stop.</w:t>
+      </w:r>
+    </w:p>
+    <w:p>
+      <w:pPr>
+        <w:pStyle w:val="ListNumber"/>
+      </w:pPr>
+      <w:r>
+        <w:rPr>
+          <w:rFonts w:ascii="Calibri" w:hAnsi="Calibri"/>
+          <w:color w:val="000000"/>
+          <w:sz w:val="22"/>
+        </w:rPr>
+        <w:t>Turn off the router/spindle.</w:t>
+      </w:r>
+    </w:p>
+    <w:p>
+      <w:pPr>
+        <w:pStyle w:val="ListNumber"/>
+      </w:pPr>
+      <w:r>
+        <w:rPr>
+          <w:rFonts w:ascii="Calibri" w:hAnsi="Calibri"/>
+          <w:color w:val="000000"/>
+          <w:sz w:val="22"/>
+        </w:rPr>
+        <w:t>Raise Z or move to a safe parking position.</w:t>
+      </w:r>
+    </w:p>
+    <w:p>
+      <w:pPr>
+        <w:pStyle w:val="ListNumber"/>
+      </w:pPr>
+      <w:r>
+        <w:rPr>
+          <w:rFonts w:ascii="Calibri" w:hAnsi="Calibri"/>
+          <w:color w:val="000000"/>
+          <w:sz w:val="22"/>
+        </w:rPr>
+        <w:t>Close the G-code job if you are finished.</w:t>
+      </w:r>
+    </w:p>
+    <w:p>
+      <w:pPr>
+        <w:pStyle w:val="ListNumber"/>
+      </w:pPr>
+      <w:r>
+        <w:rPr>
+          <w:rFonts w:ascii="Calibri" w:hAnsi="Calibri"/>
+          <w:color w:val="000000"/>
+          <w:sz w:val="22"/>
+        </w:rPr>
+        <w:t>Disconnect CNCjs from the controller.</w:t>
+      </w:r>
+    </w:p>
+    <w:p>
+      <w:pPr>
+        <w:pStyle w:val="ListNumber"/>
+      </w:pPr>
+      <w:r>
+        <w:rPr>
+          <w:rFonts w:ascii="Calibri" w:hAnsi="Calibri"/>
+          <w:color w:val="000000"/>
+          <w:sz w:val="22"/>
+        </w:rPr>
+        <w:t>Power off the controller after the machine is stationary.</w:t>
       </w:r>
     </w:p>
     <w:p>
@@ -2359,11 +3282,855 @@
           </w:p>
         </w:tc>
       </w:tr>
+      <w:tr>
+        <w:tc>
+          <w:tcPr>
+            <w:tcW w:type="dxa" w:w="4680"/>
+            <w:tcMar>
+              <w:top w:w="80" w:type="dxa"/>
+              <w:start w:w="120" w:type="dxa"/>
+              <w:bottom w:w="80" w:type="dxa"/>
+              <w:end w:w="120" w:type="dxa"/>
+            </w:tcMar>
+            <w:vAlign w:val="center"/>
+          </w:tcPr>
+          <w:p>
+            <w:pPr>
+              <w:keepLines/>
+              <w:spacing w:before="0" w:after="0" w:line="276" w:lineRule="auto"/>
+            </w:pPr>
+            <w:r/>
+            <w:r>
+              <w:rPr>
+                <w:rFonts w:ascii="Calibri" w:hAnsi="Calibri"/>
+                <w:color w:val="000000"/>
+                <w:sz w:val="21"/>
+              </w:rPr>
+              <w:t>Settings</w:t>
+            </w:r>
+          </w:p>
+        </w:tc>
+        <w:tc>
+          <w:tcPr>
+            <w:tcW w:type="dxa" w:w="4680"/>
+            <w:tcMar>
+              <w:top w:w="80" w:type="dxa"/>
+              <w:start w:w="120" w:type="dxa"/>
+              <w:bottom w:w="80" w:type="dxa"/>
+              <w:end w:w="120" w:type="dxa"/>
+            </w:tcMar>
+            <w:vAlign w:val="center"/>
+          </w:tcPr>
+          <w:p>
+            <w:pPr>
+              <w:keepLines/>
+              <w:spacing w:before="0" w:after="0" w:line="276" w:lineRule="auto"/>
+            </w:pPr>
+            <w:r/>
+            <w:r>
+              <w:rPr>
+                <w:rFonts w:ascii="Calibri" w:hAnsi="Calibri"/>
+                <w:color w:val="000000"/>
+                <w:sz w:val="21"/>
+              </w:rPr>
+              <w:t>App settings, workspace records, events, and the GRBL Settings wizard</w:t>
+            </w:r>
+          </w:p>
+        </w:tc>
+      </w:tr>
     </w:tbl>
     <w:p>
       <w:pPr>
         <w:spacing w:before="0" w:after="80" w:line="300" w:lineRule="auto"/>
       </w:pPr>
+    </w:p>
+    <w:p>
+      <w:pPr>
+        <w:pStyle w:val="Heading2"/>
+      </w:pPr>
+      <w:r>
+        <w:rPr>
+          <w:rFonts w:ascii="Calibri" w:hAnsi="Calibri"/>
+          <w:color w:val="2E74B5"/>
+          <w:sz w:val="26"/>
+        </w:rPr>
+        <w:t>GRBL Settings Wizard</w:t>
+      </w:r>
+    </w:p>
+    <w:p>
+      <w:pPr>
+        <w:keepLines/>
+        <w:spacing w:before="0" w:after="120" w:line="300" w:lineRule="auto"/>
+      </w:pPr>
+      <w:r>
+        <w:rPr>
+          <w:rFonts w:ascii="Calibri" w:hAnsi="Calibri"/>
+          <w:color w:val="000000"/>
+          <w:sz w:val="22"/>
+        </w:rPr>
+        <w:t>Use the GRBL Settings wizard when you need to inspect, back up, edit, or restore firmware settings. Open it from the desktop workspace at Settings &gt; GRBL Settings after connecting to a GRBL controller.</w:t>
+      </w:r>
+    </w:p>
+    <w:p>
+      <w:pPr>
+        <w:keepLines/>
+        <w:spacing w:before="0" w:after="120" w:line="300" w:lineRule="auto"/>
+      </w:pPr>
+      <w:r>
+        <w:rPr>
+          <w:rFonts w:ascii="Calibri" w:hAnsi="Calibri"/>
+          <w:color w:val="000000"/>
+          <w:sz w:val="22"/>
+        </w:rPr>
+        <w:t xml:space="preserve">The wizard reads settings with </w:t>
+      </w:r>
+      <w:r>
+        <w:rPr>
+          <w:rFonts w:ascii="Consolas" w:hAnsi="Consolas"/>
+          <w:color w:val="1C232B"/>
+          <w:sz w:val="21"/>
+        </w:rPr>
+        <w:t>$$</w:t>
+      </w:r>
+      <w:r>
+        <w:rPr>
+          <w:rFonts w:ascii="Calibri" w:hAnsi="Calibri"/>
+          <w:color w:val="000000"/>
+          <w:sz w:val="22"/>
+        </w:rPr>
+        <w:t xml:space="preserve"> and writes changes as normal GRBL </w:t>
+      </w:r>
+      <w:r>
+        <w:rPr>
+          <w:rFonts w:ascii="Consolas" w:hAnsi="Consolas"/>
+          <w:color w:val="1C232B"/>
+          <w:sz w:val="21"/>
+        </w:rPr>
+        <w:t>$number=value</w:t>
+      </w:r>
+      <w:r>
+        <w:rPr>
+          <w:rFonts w:ascii="Calibri" w:hAnsi="Calibri"/>
+          <w:color w:val="000000"/>
+          <w:sz w:val="22"/>
+        </w:rPr>
+        <w:t xml:space="preserve"> commands. Do not use it during a running job.</w:t>
+      </w:r>
+    </w:p>
+    <w:tbl>
+      <w:tblPr>
+        <w:tblStyle w:val="TableGrid"/>
+        <w:tblW w:type="dxa" w:w="9360"/>
+        <w:tblLayout w:type="fixed"/>
+        <w:tblLook w:firstColumn="1" w:firstRow="1" w:lastColumn="0" w:lastRow="0" w:noHBand="0" w:noVBand="1" w:val="04A0"/>
+        <w:tblInd w:w="120" w:type="dxa"/>
+      </w:tblPr>
+      <w:tblGrid>
+        <w:gridCol w:w="4680"/>
+        <w:gridCol w:w="4680"/>
+      </w:tblGrid>
+      <w:tr>
+        <w:tc>
+          <w:tcPr>
+            <w:tcW w:type="dxa" w:w="4680"/>
+            <w:tcMar>
+              <w:top w:w="80" w:type="dxa"/>
+              <w:start w:w="120" w:type="dxa"/>
+              <w:bottom w:w="80" w:type="dxa"/>
+              <w:end w:w="120" w:type="dxa"/>
+            </w:tcMar>
+            <w:vAlign w:val="center"/>
+            <w:shd w:fill="E8EEF5"/>
+          </w:tcPr>
+          <w:p>
+            <w:pPr>
+              <w:keepLines/>
+              <w:spacing w:before="0" w:after="0" w:line="276" w:lineRule="auto"/>
+            </w:pPr>
+            <w:r>
+              <w:rPr>
+                <w:b/>
+              </w:rPr>
+            </w:r>
+            <w:r>
+              <w:rPr>
+                <w:rFonts w:ascii="Calibri" w:hAnsi="Calibri"/>
+                <w:b/>
+                <w:color w:val="000000"/>
+                <w:sz w:val="21"/>
+              </w:rPr>
+              <w:t>Tab</w:t>
+            </w:r>
+          </w:p>
+        </w:tc>
+        <w:tc>
+          <w:tcPr>
+            <w:tcW w:type="dxa" w:w="4680"/>
+            <w:tcMar>
+              <w:top w:w="80" w:type="dxa"/>
+              <w:start w:w="120" w:type="dxa"/>
+              <w:bottom w:w="80" w:type="dxa"/>
+              <w:end w:w="120" w:type="dxa"/>
+            </w:tcMar>
+            <w:vAlign w:val="center"/>
+            <w:shd w:fill="E8EEF5"/>
+          </w:tcPr>
+          <w:p>
+            <w:pPr>
+              <w:keepLines/>
+              <w:spacing w:before="0" w:after="0" w:line="276" w:lineRule="auto"/>
+            </w:pPr>
+            <w:r>
+              <w:rPr>
+                <w:b/>
+              </w:rPr>
+            </w:r>
+            <w:r>
+              <w:rPr>
+                <w:rFonts w:ascii="Calibri" w:hAnsi="Calibri"/>
+                <w:b/>
+                <w:color w:val="000000"/>
+                <w:sz w:val="21"/>
+              </w:rPr>
+              <w:t>Use</w:t>
+            </w:r>
+          </w:p>
+        </w:tc>
+      </w:tr>
+      <w:tr>
+        <w:tc>
+          <w:tcPr>
+            <w:tcW w:type="dxa" w:w="4680"/>
+            <w:tcMar>
+              <w:top w:w="80" w:type="dxa"/>
+              <w:start w:w="120" w:type="dxa"/>
+              <w:bottom w:w="80" w:type="dxa"/>
+              <w:end w:w="120" w:type="dxa"/>
+            </w:tcMar>
+            <w:vAlign w:val="center"/>
+          </w:tcPr>
+          <w:p>
+            <w:pPr>
+              <w:keepLines/>
+              <w:spacing w:before="0" w:after="0" w:line="276" w:lineRule="auto"/>
+            </w:pPr>
+            <w:r/>
+            <w:r>
+              <w:rPr>
+                <w:rFonts w:ascii="Calibri" w:hAnsi="Calibri"/>
+                <w:color w:val="000000"/>
+                <w:sz w:val="21"/>
+              </w:rPr>
+              <w:t>Backup</w:t>
+            </w:r>
+          </w:p>
+        </w:tc>
+        <w:tc>
+          <w:tcPr>
+            <w:tcW w:type="dxa" w:w="4680"/>
+            <w:tcMar>
+              <w:top w:w="80" w:type="dxa"/>
+              <w:start w:w="120" w:type="dxa"/>
+              <w:bottom w:w="80" w:type="dxa"/>
+              <w:end w:w="120" w:type="dxa"/>
+            </w:tcMar>
+            <w:vAlign w:val="center"/>
+          </w:tcPr>
+          <w:p>
+            <w:pPr>
+              <w:keepLines/>
+              <w:spacing w:before="0" w:after="0" w:line="276" w:lineRule="auto"/>
+            </w:pPr>
+            <w:r/>
+            <w:r>
+              <w:rPr>
+                <w:rFonts w:ascii="Calibri" w:hAnsi="Calibri"/>
+                <w:color w:val="000000"/>
+                <w:sz w:val="21"/>
+              </w:rPr>
+              <w:t>Save the current settings to a backup file, load a previous backup file, and flash settings from that file</w:t>
+            </w:r>
+          </w:p>
+        </w:tc>
+      </w:tr>
+      <w:tr>
+        <w:tc>
+          <w:tcPr>
+            <w:tcW w:type="dxa" w:w="4680"/>
+            <w:tcMar>
+              <w:top w:w="80" w:type="dxa"/>
+              <w:start w:w="120" w:type="dxa"/>
+              <w:bottom w:w="80" w:type="dxa"/>
+              <w:end w:w="120" w:type="dxa"/>
+            </w:tcMar>
+            <w:vAlign w:val="center"/>
+          </w:tcPr>
+          <w:p>
+            <w:pPr>
+              <w:keepLines/>
+              <w:spacing w:before="0" w:after="0" w:line="276" w:lineRule="auto"/>
+            </w:pPr>
+            <w:r/>
+            <w:r>
+              <w:rPr>
+                <w:rFonts w:ascii="Calibri" w:hAnsi="Calibri"/>
+                <w:color w:val="000000"/>
+                <w:sz w:val="21"/>
+              </w:rPr>
+              <w:t>Motion</w:t>
+            </w:r>
+          </w:p>
+        </w:tc>
+        <w:tc>
+          <w:tcPr>
+            <w:tcW w:type="dxa" w:w="4680"/>
+            <w:tcMar>
+              <w:top w:w="80" w:type="dxa"/>
+              <w:start w:w="120" w:type="dxa"/>
+              <w:bottom w:w="80" w:type="dxa"/>
+              <w:end w:w="120" w:type="dxa"/>
+            </w:tcMar>
+            <w:vAlign w:val="center"/>
+          </w:tcPr>
+          <w:p>
+            <w:pPr>
+              <w:keepLines/>
+              <w:spacing w:before="0" w:after="0" w:line="276" w:lineRule="auto"/>
+            </w:pPr>
+            <w:r/>
+            <w:r>
+              <w:rPr>
+                <w:rFonts w:ascii="Calibri" w:hAnsi="Calibri"/>
+                <w:color w:val="000000"/>
+                <w:sz w:val="21"/>
+              </w:rPr>
+              <w:t>Edit travel resolution, maximum rates, acceleration, travel limits, and steps/mm calibration</w:t>
+            </w:r>
+          </w:p>
+        </w:tc>
+      </w:tr>
+      <w:tr>
+        <w:tc>
+          <w:tcPr>
+            <w:tcW w:type="dxa" w:w="4680"/>
+            <w:tcMar>
+              <w:top w:w="80" w:type="dxa"/>
+              <w:start w:w="120" w:type="dxa"/>
+              <w:bottom w:w="80" w:type="dxa"/>
+              <w:end w:w="120" w:type="dxa"/>
+            </w:tcMar>
+            <w:vAlign w:val="center"/>
+          </w:tcPr>
+          <w:p>
+            <w:pPr>
+              <w:keepLines/>
+              <w:spacing w:before="0" w:after="0" w:line="276" w:lineRule="auto"/>
+            </w:pPr>
+            <w:r/>
+            <w:r>
+              <w:rPr>
+                <w:rFonts w:ascii="Calibri" w:hAnsi="Calibri"/>
+                <w:color w:val="000000"/>
+                <w:sz w:val="21"/>
+              </w:rPr>
+              <w:t>Homing &amp; Limits</w:t>
+            </w:r>
+          </w:p>
+        </w:tc>
+        <w:tc>
+          <w:tcPr>
+            <w:tcW w:type="dxa" w:w="4680"/>
+            <w:tcMar>
+              <w:top w:w="80" w:type="dxa"/>
+              <w:start w:w="120" w:type="dxa"/>
+              <w:bottom w:w="80" w:type="dxa"/>
+              <w:end w:w="120" w:type="dxa"/>
+            </w:tcMar>
+            <w:vAlign w:val="center"/>
+          </w:tcPr>
+          <w:p>
+            <w:pPr>
+              <w:keepLines/>
+              <w:spacing w:before="0" w:after="0" w:line="276" w:lineRule="auto"/>
+            </w:pPr>
+            <w:r/>
+            <w:r>
+              <w:rPr>
+                <w:rFonts w:ascii="Calibri" w:hAnsi="Calibri"/>
+                <w:color w:val="000000"/>
+                <w:sz w:val="21"/>
+              </w:rPr>
+              <w:t>Edit limit switch, homing, debounce, search, feed, and pull-off settings</w:t>
+            </w:r>
+          </w:p>
+        </w:tc>
+      </w:tr>
+      <w:tr>
+        <w:tc>
+          <w:tcPr>
+            <w:tcW w:type="dxa" w:w="4680"/>
+            <w:tcMar>
+              <w:top w:w="80" w:type="dxa"/>
+              <w:start w:w="120" w:type="dxa"/>
+              <w:bottom w:w="80" w:type="dxa"/>
+              <w:end w:w="120" w:type="dxa"/>
+            </w:tcMar>
+            <w:vAlign w:val="center"/>
+          </w:tcPr>
+          <w:p>
+            <w:pPr>
+              <w:keepLines/>
+              <w:spacing w:before="0" w:after="0" w:line="276" w:lineRule="auto"/>
+            </w:pPr>
+            <w:r/>
+            <w:r>
+              <w:rPr>
+                <w:rFonts w:ascii="Calibri" w:hAnsi="Calibri"/>
+                <w:color w:val="000000"/>
+                <w:sz w:val="21"/>
+              </w:rPr>
+              <w:t>Spindle &amp; Laser</w:t>
+            </w:r>
+          </w:p>
+        </w:tc>
+        <w:tc>
+          <w:tcPr>
+            <w:tcW w:type="dxa" w:w="4680"/>
+            <w:tcMar>
+              <w:top w:w="80" w:type="dxa"/>
+              <w:start w:w="120" w:type="dxa"/>
+              <w:bottom w:w="80" w:type="dxa"/>
+              <w:end w:w="120" w:type="dxa"/>
+            </w:tcMar>
+            <w:vAlign w:val="center"/>
+          </w:tcPr>
+          <w:p>
+            <w:pPr>
+              <w:keepLines/>
+              <w:spacing w:before="0" w:after="0" w:line="276" w:lineRule="auto"/>
+            </w:pPr>
+            <w:r/>
+            <w:r>
+              <w:rPr>
+                <w:rFonts w:ascii="Calibri" w:hAnsi="Calibri"/>
+                <w:color w:val="000000"/>
+                <w:sz w:val="21"/>
+              </w:rPr>
+              <w:t>Edit spindle speed range and laser mode</w:t>
+            </w:r>
+          </w:p>
+        </w:tc>
+      </w:tr>
+      <w:tr>
+        <w:tc>
+          <w:tcPr>
+            <w:tcW w:type="dxa" w:w="4680"/>
+            <w:tcMar>
+              <w:top w:w="80" w:type="dxa"/>
+              <w:start w:w="120" w:type="dxa"/>
+              <w:bottom w:w="80" w:type="dxa"/>
+              <w:end w:w="120" w:type="dxa"/>
+            </w:tcMar>
+            <w:vAlign w:val="center"/>
+          </w:tcPr>
+          <w:p>
+            <w:pPr>
+              <w:keepLines/>
+              <w:spacing w:before="0" w:after="0" w:line="276" w:lineRule="auto"/>
+            </w:pPr>
+            <w:r/>
+            <w:r>
+              <w:rPr>
+                <w:rFonts w:ascii="Calibri" w:hAnsi="Calibri"/>
+                <w:color w:val="000000"/>
+                <w:sz w:val="21"/>
+              </w:rPr>
+              <w:t>Advanced</w:t>
+            </w:r>
+          </w:p>
+        </w:tc>
+        <w:tc>
+          <w:tcPr>
+            <w:tcW w:type="dxa" w:w="4680"/>
+            <w:tcMar>
+              <w:top w:w="80" w:type="dxa"/>
+              <w:start w:w="120" w:type="dxa"/>
+              <w:bottom w:w="80" w:type="dxa"/>
+              <w:end w:w="120" w:type="dxa"/>
+            </w:tcMar>
+            <w:vAlign w:val="center"/>
+          </w:tcPr>
+          <w:p>
+            <w:pPr>
+              <w:keepLines/>
+              <w:spacing w:before="0" w:after="0" w:line="276" w:lineRule="auto"/>
+            </w:pPr>
+            <w:r/>
+            <w:r>
+              <w:rPr>
+                <w:rFonts w:ascii="Calibri" w:hAnsi="Calibri"/>
+                <w:color w:val="000000"/>
+                <w:sz w:val="21"/>
+              </w:rPr>
+              <w:t>Edit pulse, invert, report, junction, arc, and unit-reporting settings</w:t>
+            </w:r>
+          </w:p>
+        </w:tc>
+      </w:tr>
+    </w:tbl>
+    <w:p>
+      <w:pPr>
+        <w:spacing w:before="0" w:after="80" w:line="300" w:lineRule="auto"/>
+      </w:pPr>
+    </w:p>
+    <w:p>
+      <w:pPr>
+        <w:pStyle w:val="Heading3"/>
+      </w:pPr>
+      <w:r>
+        <w:rPr>
+          <w:rFonts w:ascii="Calibri" w:hAnsi="Calibri"/>
+          <w:color w:val="1F4D78"/>
+          <w:sz w:val="24"/>
+        </w:rPr>
+        <w:t>Back Up GRBL Settings</w:t>
+      </w:r>
+    </w:p>
+    <w:p>
+      <w:pPr>
+        <w:pStyle w:val="ListNumber"/>
+      </w:pPr>
+      <w:r>
+        <w:rPr>
+          <w:rFonts w:ascii="Calibri" w:hAnsi="Calibri"/>
+          <w:color w:val="000000"/>
+          <w:sz w:val="22"/>
+        </w:rPr>
+        <w:t>Connect to the GRBL controller.</w:t>
+      </w:r>
+    </w:p>
+    <w:p>
+      <w:pPr>
+        <w:pStyle w:val="ListNumber"/>
+      </w:pPr>
+      <w:r>
+        <w:rPr>
+          <w:rFonts w:ascii="Calibri" w:hAnsi="Calibri"/>
+          <w:color w:val="000000"/>
+          <w:sz w:val="22"/>
+        </w:rPr>
+        <w:t>Open Settings &gt; GRBL Settings.</w:t>
+      </w:r>
+    </w:p>
+    <w:p>
+      <w:pPr>
+        <w:pStyle w:val="ListNumber"/>
+      </w:pPr>
+      <w:r>
+        <w:rPr>
+          <w:rFonts w:ascii="Calibri" w:hAnsi="Calibri"/>
+          <w:color w:val="000000"/>
+          <w:sz w:val="22"/>
+        </w:rPr>
+        <w:t>Click Refresh if the settings list is empty or stale.</w:t>
+      </w:r>
+    </w:p>
+    <w:p>
+      <w:pPr>
+        <w:pStyle w:val="ListNumber"/>
+      </w:pPr>
+      <w:r>
+        <w:rPr>
+          <w:rFonts w:ascii="Calibri" w:hAnsi="Calibri"/>
+          <w:color w:val="000000"/>
+          <w:sz w:val="22"/>
+        </w:rPr>
+        <w:t>Open the Backup tab.</w:t>
+      </w:r>
+    </w:p>
+    <w:p>
+      <w:pPr>
+        <w:pStyle w:val="ListNumber"/>
+      </w:pPr>
+      <w:r>
+        <w:rPr>
+          <w:rFonts w:ascii="Calibri" w:hAnsi="Calibri"/>
+          <w:color w:val="000000"/>
+          <w:sz w:val="22"/>
+        </w:rPr>
+        <w:t>Click Back Up.</w:t>
+      </w:r>
+    </w:p>
+    <w:p>
+      <w:pPr>
+        <w:pStyle w:val="ListNumber"/>
+      </w:pPr>
+      <w:r>
+        <w:rPr>
+          <w:rFonts w:ascii="Calibri" w:hAnsi="Calibri"/>
+          <w:color w:val="000000"/>
+          <w:sz w:val="22"/>
+        </w:rPr>
+        <w:t xml:space="preserve">Keep the downloaded </w:t>
+      </w:r>
+      <w:r>
+        <w:rPr>
+          <w:rFonts w:ascii="Consolas" w:hAnsi="Consolas"/>
+          <w:color w:val="1C232B"/>
+          <w:sz w:val="21"/>
+        </w:rPr>
+        <w:t>grbl-settings-YYYYMMDD-HHMMSS.txt</w:t>
+      </w:r>
+      <w:r>
+        <w:rPr>
+          <w:rFonts w:ascii="Calibri" w:hAnsi="Calibri"/>
+          <w:color w:val="000000"/>
+          <w:sz w:val="22"/>
+        </w:rPr>
+        <w:t xml:space="preserve"> file somewhere safe.</w:t>
+      </w:r>
+    </w:p>
+    <w:p>
+      <w:pPr>
+        <w:keepLines/>
+        <w:spacing w:before="0" w:after="120" w:line="300" w:lineRule="auto"/>
+      </w:pPr>
+      <w:r>
+        <w:rPr>
+          <w:rFonts w:ascii="Calibri" w:hAnsi="Calibri"/>
+          <w:color w:val="000000"/>
+          <w:sz w:val="22"/>
+        </w:rPr>
+        <w:t xml:space="preserve">The backup file contains readable comments plus flashable </w:t>
+      </w:r>
+      <w:r>
+        <w:rPr>
+          <w:rFonts w:ascii="Consolas" w:hAnsi="Consolas"/>
+          <w:color w:val="1C232B"/>
+          <w:sz w:val="21"/>
+        </w:rPr>
+        <w:t>$number=value</w:t>
+      </w:r>
+      <w:r>
+        <w:rPr>
+          <w:rFonts w:ascii="Calibri" w:hAnsi="Calibri"/>
+          <w:color w:val="000000"/>
+          <w:sz w:val="22"/>
+        </w:rPr>
+        <w:t xml:space="preserve"> lines. The wizard also displays the generated or loaded file so you can inspect it before using it.</w:t>
+      </w:r>
+    </w:p>
+    <w:p>
+      <w:pPr>
+        <w:pStyle w:val="Heading3"/>
+      </w:pPr>
+      <w:r>
+        <w:rPr>
+          <w:rFonts w:ascii="Calibri" w:hAnsi="Calibri"/>
+          <w:color w:val="1F4D78"/>
+          <w:sz w:val="24"/>
+        </w:rPr>
+        <w:t>Restore A Backup File</w:t>
+      </w:r>
+    </w:p>
+    <w:p>
+      <w:pPr>
+        <w:pStyle w:val="ListNumber"/>
+      </w:pPr>
+      <w:r>
+        <w:rPr>
+          <w:rFonts w:ascii="Calibri" w:hAnsi="Calibri"/>
+          <w:color w:val="000000"/>
+          <w:sz w:val="22"/>
+        </w:rPr>
+        <w:t>Connect to the same GRBL controller or a compatible replacement controller.</w:t>
+      </w:r>
+    </w:p>
+    <w:p>
+      <w:pPr>
+        <w:pStyle w:val="ListNumber"/>
+      </w:pPr>
+      <w:r>
+        <w:rPr>
+          <w:rFonts w:ascii="Calibri" w:hAnsi="Calibri"/>
+          <w:color w:val="000000"/>
+          <w:sz w:val="22"/>
+        </w:rPr>
+        <w:t>Open Settings &gt; GRBL Settings &gt; Backup.</w:t>
+      </w:r>
+    </w:p>
+    <w:p>
+      <w:pPr>
+        <w:pStyle w:val="ListNumber"/>
+      </w:pPr>
+      <w:r>
+        <w:rPr>
+          <w:rFonts w:ascii="Calibri" w:hAnsi="Calibri"/>
+          <w:color w:val="000000"/>
+          <w:sz w:val="22"/>
+        </w:rPr>
+        <w:t>Click Choose Backup File and select the saved settings file.</w:t>
+      </w:r>
+    </w:p>
+    <w:p>
+      <w:pPr>
+        <w:pStyle w:val="ListNumber"/>
+      </w:pPr>
+      <w:r>
+        <w:rPr>
+          <w:rFonts w:ascii="Calibri" w:hAnsi="Calibri"/>
+          <w:color w:val="000000"/>
+          <w:sz w:val="22"/>
+        </w:rPr>
+        <w:t>Confirm the displayed file contains the settings you expect.</w:t>
+      </w:r>
+    </w:p>
+    <w:p>
+      <w:pPr>
+        <w:pStyle w:val="ListNumber"/>
+      </w:pPr>
+      <w:r>
+        <w:rPr>
+          <w:rFonts w:ascii="Calibri" w:hAnsi="Calibri"/>
+          <w:color w:val="000000"/>
+          <w:sz w:val="22"/>
+        </w:rPr>
+        <w:t>Click Flash Backup.</w:t>
+      </w:r>
+    </w:p>
+    <w:p>
+      <w:pPr>
+        <w:pStyle w:val="ListNumber"/>
+      </w:pPr>
+      <w:r>
+        <w:rPr>
+          <w:rFonts w:ascii="Calibri" w:hAnsi="Calibri"/>
+          <w:color w:val="000000"/>
+          <w:sz w:val="22"/>
+        </w:rPr>
+        <w:t>Confirm the inline warning.</w:t>
+      </w:r>
+    </w:p>
+    <w:p>
+      <w:pPr>
+        <w:pStyle w:val="ListNumber"/>
+      </w:pPr>
+      <w:r>
+        <w:rPr>
+          <w:rFonts w:ascii="Calibri" w:hAnsi="Calibri"/>
+          <w:color w:val="000000"/>
+          <w:sz w:val="22"/>
+        </w:rPr>
+        <w:t xml:space="preserve">Wait for the wizard to send the settings and read </w:t>
+      </w:r>
+      <w:r>
+        <w:rPr>
+          <w:rFonts w:ascii="Consolas" w:hAnsi="Consolas"/>
+          <w:color w:val="1C232B"/>
+          <w:sz w:val="21"/>
+        </w:rPr>
+        <w:t>$$</w:t>
+      </w:r>
+      <w:r>
+        <w:rPr>
+          <w:rFonts w:ascii="Calibri" w:hAnsi="Calibri"/>
+          <w:color w:val="000000"/>
+          <w:sz w:val="22"/>
+        </w:rPr>
+        <w:t xml:space="preserve"> back from GRBL.</w:t>
+      </w:r>
+    </w:p>
+    <w:p>
+      <w:pPr>
+        <w:keepLines/>
+        <w:spacing w:before="0" w:after="120" w:line="300" w:lineRule="auto"/>
+      </w:pPr>
+      <w:r>
+        <w:rPr>
+          <w:rFonts w:ascii="Calibri" w:hAnsi="Calibri"/>
+          <w:color w:val="000000"/>
+          <w:sz w:val="22"/>
+        </w:rPr>
+        <w:t>Only flash backup files you trust. A GRBL settings file can change steps/mm, axis direction, limit behavior, homing behavior, spindle speed mapping, and laser mode.</w:t>
+      </w:r>
+    </w:p>
+    <w:p>
+      <w:pPr>
+        <w:pStyle w:val="Heading3"/>
+      </w:pPr>
+      <w:r>
+        <w:rPr>
+          <w:rFonts w:ascii="Calibri" w:hAnsi="Calibri"/>
+          <w:color w:val="1F4D78"/>
+          <w:sz w:val="24"/>
+        </w:rPr>
+        <w:t>Safe Editing Rules</w:t>
+      </w:r>
+    </w:p>
+    <w:p>
+      <w:pPr>
+        <w:pStyle w:val="ListNumber"/>
+      </w:pPr>
+      <w:r>
+        <w:rPr>
+          <w:rFonts w:ascii="Calibri" w:hAnsi="Calibri"/>
+          <w:color w:val="000000"/>
+          <w:sz w:val="22"/>
+        </w:rPr>
+        <w:t>Back up the current settings before making changes.</w:t>
+      </w:r>
+    </w:p>
+    <w:p>
+      <w:pPr>
+        <w:pStyle w:val="ListNumber"/>
+      </w:pPr>
+      <w:r>
+        <w:rPr>
+          <w:rFonts w:ascii="Calibri" w:hAnsi="Calibri"/>
+          <w:color w:val="000000"/>
+          <w:sz w:val="22"/>
+        </w:rPr>
+        <w:t>Change one group of settings at a time.</w:t>
+      </w:r>
+    </w:p>
+    <w:p>
+      <w:pPr>
+        <w:pStyle w:val="ListNumber"/>
+      </w:pPr>
+      <w:r>
+        <w:rPr>
+          <w:rFonts w:ascii="Calibri" w:hAnsi="Calibri"/>
+          <w:color w:val="000000"/>
+          <w:sz w:val="22"/>
+        </w:rPr>
+        <w:t>Keep the machine idle and the router/spindle off while changing firmware settings.</w:t>
+      </w:r>
+    </w:p>
+    <w:p>
+      <w:pPr>
+        <w:pStyle w:val="ListNumber"/>
+      </w:pPr>
+      <w:r>
+        <w:rPr>
+          <w:rFonts w:ascii="Calibri" w:hAnsi="Calibri"/>
+          <w:color w:val="000000"/>
+          <w:sz w:val="22"/>
+        </w:rPr>
+        <w:t>Test jog direction, travel distance, homing, limits, and probing before cutting again.</w:t>
+      </w:r>
+    </w:p>
+    <w:p>
+      <w:pPr>
+        <w:pStyle w:val="ListNumber"/>
+      </w:pPr>
+      <w:r>
+        <w:rPr>
+          <w:rFonts w:ascii="Calibri" w:hAnsi="Calibri"/>
+          <w:color w:val="000000"/>
+          <w:sz w:val="22"/>
+        </w:rPr>
+        <w:t>If a change makes the machine behave incorrectly, reload the backup file and flash it back.</w:t>
+      </w:r>
     </w:p>
     <w:p>
       <w:pPr>

</xml_diff>

<commit_message>
Document skew calibration wizard
</commit_message>
<xml_diff>
--- a/docs/CNCjs_Pendant_User_Manual.docx
+++ b/docs/CNCjs_Pendant_User_Manual.docx
@@ -1,5 +1,70 @@
 
-<file path=word/document.xml><?xml version="1.0" encoding="utf-8"?>
+<file path=customXml\item1.xml><?xml version="1.0" encoding="utf-8"?>
+<b:Sources xmlns:b="http://schemas.openxmlformats.org/officeDocument/2006/bibliography" xmlns="http://schemas.openxmlformats.org/officeDocument/2006/bibliography" SelectedStyle="/APA.XSL" StyleName="APA"/>
+</file>
+
+<file path=customXml\itemProps1.xml><?xml version="1.0" encoding="utf-8"?>
+<ds:datastoreItem xmlns:ds="http://schemas.openxmlformats.org/officeDocument/2006/customXml" ds:itemID="{EF278816-EC6F-A645-907D-7F25AECB1D4A}">
+  <ds:schemaRefs>
+    <ds:schemaRef ds:uri="http://schemas.openxmlformats.org/officeDocument/2006/bibliography"/>
+  </ds:schemaRefs>
+</ds:datastoreItem>
+</file>
+
+<file path=docProps\app.xml><?xml version="1.0" encoding="utf-8"?>
+<Properties xmlns="http://schemas.openxmlformats.org/officeDocument/2006/extended-properties" xmlns:vt="http://schemas.openxmlformats.org/officeDocument/2006/docPropsVTypes">
+  <Template>Normal.dotm</Template>
+  <TotalTime>0</TotalTime>
+  <Pages>1</Pages>
+  <Words>0</Words>
+  <Characters>0</Characters>
+  <Application>Microsoft Macintosh Word</Application>
+  <DocSecurity>0</DocSecurity>
+  <Lines>0</Lines>
+  <Paragraphs>0</Paragraphs>
+  <ScaleCrop>false</ScaleCrop>
+  <HeadingPairs>
+    <vt:vector size="2" baseType="variant">
+      <vt:variant>
+        <vt:lpstr>Title</vt:lpstr>
+      </vt:variant>
+      <vt:variant>
+        <vt:i4>1</vt:i4>
+      </vt:variant>
+    </vt:vector>
+  </HeadingPairs>
+  <TitlesOfParts>
+    <vt:vector size="1" baseType="lpstr">
+      <vt:lpstr/>
+    </vt:vector>
+  </TitlesOfParts>
+  <Manager/>
+  <Company/>
+  <LinksUpToDate>false</LinksUpToDate>
+  <CharactersWithSpaces>0</CharactersWithSpaces>
+  <SharedDoc>false</SharedDoc>
+  <HyperlinkBase/>
+  <HyperlinksChanged>false</HyperlinksChanged>
+  <AppVersion>14.0000</AppVersion>
+</Properties>
+</file>
+
+<file path=docProps\core.xml><?xml version="1.0" encoding="utf-8"?>
+<cp:coreProperties xmlns:cp="http://schemas.openxmlformats.org/package/2006/metadata/core-properties" xmlns:dc="http://purl.org/dc/elements/1.1/" xmlns:dcterms="http://purl.org/dc/terms/" xmlns:dcmitype="http://purl.org/dc/dcmitype/" xmlns:xsi="http://www.w3.org/2001/XMLSchema-instance">
+  <dc:title/>
+  <dc:subject/>
+  <dc:creator>python-docx</dc:creator>
+  <cp:keywords/>
+  <dc:description>generated by python-docx</dc:description>
+  <cp:lastModifiedBy/>
+  <cp:revision>1</cp:revision>
+  <dcterms:created xsi:type="dcterms:W3CDTF">2013-12-23T23:15:00Z</dcterms:created>
+  <dcterms:modified xsi:type="dcterms:W3CDTF">2013-12-23T23:15:00Z</dcterms:modified>
+  <cp:category/>
+</cp:coreProperties>
+</file>
+
+<file path=word\document.xml><?xml version="1.0" encoding="utf-8"?>
 <w:document xmlns:wpc="http://schemas.microsoft.com/office/word/2010/wordprocessingCanvas" xmlns:mo="http://schemas.microsoft.com/office/mac/office/2008/main" xmlns:mc="http://schemas.openxmlformats.org/markup-compatibility/2006" xmlns:mv="urn:schemas-microsoft-com:mac:vml" xmlns:o="urn:schemas-microsoft-com:office:office" xmlns:r="http://schemas.openxmlformats.org/officeDocument/2006/relationships" xmlns:m="http://schemas.openxmlformats.org/officeDocument/2006/math" xmlns:v="urn:schemas-microsoft-com:vml" xmlns:wp14="http://schemas.microsoft.com/office/word/2010/wordprocessingDrawing" xmlns:wp="http://schemas.openxmlformats.org/drawingml/2006/wordprocessingDrawing" xmlns:w10="urn:schemas-microsoft-com:office:word" xmlns:w="http://schemas.openxmlformats.org/wordprocessingml/2006/main" xmlns:w14="http://schemas.microsoft.com/office/word/2010/wordml" xmlns:wpg="http://schemas.microsoft.com/office/word/2010/wordprocessingGroup" xmlns:wpi="http://schemas.microsoft.com/office/word/2010/wordprocessingInk" xmlns:wne="http://schemas.microsoft.com/office/word/2006/wordml" xmlns:wps="http://schemas.microsoft.com/office/word/2010/wordprocessingShape" mc:Ignorable="w14 wp14">
   <w:body>
     <w:p>
@@ -357,7 +422,7 @@
                 <w:color w:val="000000"/>
                 <w:sz w:val="21"/>
               </w:rPr>
-              <w:t>May 17, 2026</w:t>
+              <w:t>June 3, 2026</w:t>
             </w:r>
           </w:p>
         </w:tc>
@@ -4130,6 +4195,272 @@
           <w:sz w:val="22"/>
         </w:rPr>
         <w:t>If a change makes the machine behave incorrectly, reload the backup file and flash it back.</w:t>
+      </w:r>
+    </w:p>
+    <w:p>
+      <w:pPr>
+        <w:pStyle w:val="Heading2"/>
+      </w:pPr>
+      <w:r>
+        <w:rPr>
+          <w:rFonts w:ascii="Calibri" w:hAnsi="Calibri"/>
+          <w:color w:val="000000"/>
+          <w:sz w:val="22"/>
+        </w:rPr>
+        <w:t>Calibration Widget</w:t>
+      </w:r>
+    </w:p>
+    <w:p>
+      <w:pPr>
+        <w:keepLines/>
+        <w:spacing w:before="0" w:after="120" w:line="300" w:lineRule="auto"/>
+      </w:pPr>
+      <w:r>
+        <w:rPr>
+          <w:rFonts w:ascii="Calibri" w:hAnsi="Calibri"/>
+          <w:color w:val="000000"/>
+          <w:sz w:val="22"/>
+        </w:rPr>
+        <w:t>Use the Calibration widget for the Machine It GRBL XY skew compensation workflow. This wizard does not rewrite loaded G-code. It only calculates the firmware skew value and sends GRBL settings; the custom firmware applies the correction during motion planning.</w:t>
+      </w:r>
+    </w:p>
+    <w:p>
+      <w:pPr>
+        <w:keepLines/>
+        <w:spacing w:before="0" w:after="120" w:line="300" w:lineRule="auto"/>
+      </w:pPr>
+      <w:r>
+        <w:rPr>
+          <w:rFonts w:ascii="Calibri" w:hAnsi="Calibri"/>
+          <w:color w:val="000000"/>
+          <w:sz w:val="22"/>
+        </w:rPr>
+        <w:t>Open the widget from the desktop workspace after connecting to GRBL. At the start of the session, the widget reads $$ so it can show the current $140 skew enable state, the current $141 skew factor, and the matching skew angle.</w:t>
+      </w:r>
+    </w:p>
+    <w:p>
+      <w:pPr>
+        <w:keepLines/>
+        <w:spacing w:before="0" w:after="120" w:line="300" w:lineRule="auto"/>
+      </w:pPr>
+      <w:r>
+        <w:rPr>
+          <w:rFonts w:ascii="Calibri" w:hAnsi="Calibri"/>
+          <w:color w:val="000000"/>
+          <w:sz w:val="22"/>
+        </w:rPr>
+        <w:t>Controls: Enable Skew sends $140=1. Disable Skew sends $140=0. Start &amp; Turn Off Skew sends $140=0 before the calibration test cut. Flip Sign reverses the calculated correction direction. Apply &amp; Turn On sends $141=&lt;factor&gt;, then $140=1, then reads $$ again.</w:t>
+      </w:r>
+    </w:p>
+    <w:p>
+      <w:pPr>
+        <w:pStyle w:val="Heading3"/>
+      </w:pPr>
+      <w:r>
+        <w:rPr>
+          <w:rFonts w:ascii="Calibri" w:hAnsi="Calibri"/>
+          <w:color w:val="000000"/>
+          <w:sz w:val="22"/>
+        </w:rPr>
+        <w:t>XY Skew Test-Cut Workflow</w:t>
+      </w:r>
+    </w:p>
+    <w:p>
+      <w:pPr>
+        <w:pStyle w:val="ListNumber"/>
+      </w:pPr>
+      <w:r>
+        <w:rPr>
+          <w:rFonts w:ascii="Calibri" w:hAnsi="Calibri"/>
+          <w:color w:val="000000"/>
+          <w:sz w:val="22"/>
+        </w:rPr>
+        <w:t>Connect to the GRBL controller and make sure the machine is idle.</w:t>
+      </w:r>
+    </w:p>
+    <w:p>
+      <w:pPr>
+        <w:pStyle w:val="ListNumber"/>
+      </w:pPr>
+      <w:r>
+        <w:rPr>
+          <w:rFonts w:ascii="Calibri" w:hAnsi="Calibri"/>
+          <w:color w:val="000000"/>
+          <w:sz w:val="22"/>
+        </w:rPr>
+        <w:t>Open the Calibration widget.</w:t>
+      </w:r>
+    </w:p>
+    <w:p>
+      <w:pPr>
+        <w:pStyle w:val="ListNumber"/>
+      </w:pPr>
+      <w:r>
+        <w:rPr>
+          <w:rFonts w:ascii="Calibri" w:hAnsi="Calibri"/>
+          <w:color w:val="000000"/>
+          <w:sz w:val="22"/>
+        </w:rPr>
+        <w:t>Enter the programmed square size from the calibration G-code. This is the straight side length, such as 20 mm, 40 mm, 100 mm, or any other size you actually cut.</w:t>
+      </w:r>
+    </w:p>
+    <w:p>
+      <w:pPr>
+        <w:pStyle w:val="ListNumber"/>
+      </w:pPr>
+      <w:r>
+        <w:rPr>
+          <w:rFonts w:ascii="Calibri" w:hAnsi="Calibri"/>
+          <w:color w:val="000000"/>
+          <w:sz w:val="22"/>
+        </w:rPr>
+        <w:t>Click Start &amp; Turn Off Skew. The wizard sends $140=0.</w:t>
+      </w:r>
+    </w:p>
+    <w:p>
+      <w:pPr>
+        <w:pStyle w:val="ListNumber"/>
+      </w:pPr>
+      <w:r>
+        <w:rPr>
+          <w:rFonts w:ascii="Calibri" w:hAnsi="Calibri"/>
+          <w:color w:val="000000"/>
+          <w:sz w:val="22"/>
+        </w:rPr>
+        <w:t>Load and run the chamfered square calibration G-code.</w:t>
+      </w:r>
+    </w:p>
+    <w:p>
+      <w:pPr>
+        <w:pStyle w:val="ListNumber"/>
+      </w:pPr>
+      <w:r>
+        <w:rPr>
+          <w:rFonts w:ascii="Calibri" w:hAnsi="Calibri"/>
+          <w:color w:val="000000"/>
+          <w:sz w:val="22"/>
+        </w:rPr>
+        <w:t>When the cut is finished, return to the Calibration widget and click the cut-done step.</w:t>
+      </w:r>
+    </w:p>
+    <w:p>
+      <w:pPr>
+        <w:pStyle w:val="ListNumber"/>
+      </w:pPr>
+      <w:r>
+        <w:rPr>
+          <w:rFonts w:ascii="Calibri" w:hAnsi="Calibri"/>
+          <w:color w:val="000000"/>
+          <w:sz w:val="22"/>
+        </w:rPr>
+        <w:t>Identify the corners this way: A is front-left, B is front-right, C is back-right, and D is back-left.</w:t>
+      </w:r>
+    </w:p>
+    <w:p>
+      <w:pPr>
+        <w:pStyle w:val="ListNumber"/>
+      </w:pPr>
+      <w:r>
+        <w:rPr>
+          <w:rFonts w:ascii="Calibri" w:hAnsi="Calibri"/>
+          <w:color w:val="000000"/>
+          <w:sz w:val="22"/>
+        </w:rPr>
+        <w:t>Measure only the two opposite-corner distances: A-C and B-D.</w:t>
+      </w:r>
+    </w:p>
+    <w:p>
+      <w:pPr>
+        <w:pStyle w:val="ListNumber"/>
+      </w:pPr>
+      <w:r>
+        <w:rPr>
+          <w:rFonts w:ascii="Calibri" w:hAnsi="Calibri"/>
+          <w:color w:val="000000"/>
+          <w:sz w:val="22"/>
+        </w:rPr>
+        <w:t>Enter the A-C and B-D measurements in millimeters.</w:t>
+      </w:r>
+    </w:p>
+    <w:p>
+      <w:pPr>
+        <w:pStyle w:val="ListNumber"/>
+      </w:pPr>
+      <w:r>
+        <w:rPr>
+          <w:rFonts w:ascii="Calibri" w:hAnsi="Calibri"/>
+          <w:color w:val="000000"/>
+          <w:sz w:val="22"/>
+        </w:rPr>
+        <w:t>Review the calculated skew factor and angle.</w:t>
+      </w:r>
+    </w:p>
+    <w:p>
+      <w:pPr>
+        <w:pStyle w:val="ListNumber"/>
+      </w:pPr>
+      <w:r>
+        <w:rPr>
+          <w:rFonts w:ascii="Calibri" w:hAnsi="Calibri"/>
+          <w:color w:val="000000"/>
+          <w:sz w:val="22"/>
+        </w:rPr>
+        <w:t>If a follow-up test cut gets worse, use Flip Sign and apply the opposite sign.</w:t>
+      </w:r>
+    </w:p>
+    <w:p>
+      <w:pPr>
+        <w:pStyle w:val="ListNumber"/>
+      </w:pPr>
+      <w:r>
+        <w:rPr>
+          <w:rFonts w:ascii="Calibri" w:hAnsi="Calibri"/>
+          <w:color w:val="000000"/>
+          <w:sz w:val="22"/>
+        </w:rPr>
+        <w:t>Click Apply &amp; Turn On. The wizard sends the clamped $141 factor and turns $140 back on.</w:t>
+      </w:r>
+    </w:p>
+    <w:p>
+      <w:pPr>
+        <w:keepLines/>
+        <w:spacing w:before="0" w:after="120" w:line="300" w:lineRule="auto"/>
+      </w:pPr>
+      <w:r>
+        <w:rPr>
+          <w:rFonts w:ascii="Calibri" w:hAnsi="Calibri"/>
+          <w:color w:val="000000"/>
+          <w:sz w:val="22"/>
+        </w:rPr>
+        <w:t>Calculation: factor = (AC^2 - BD^2) / (4 * programmed_size^2).</w:t>
+      </w:r>
+    </w:p>
+    <w:p>
+      <w:pPr>
+        <w:keepLines/>
+        <w:spacing w:before="0" w:after="120" w:line="300" w:lineRule="auto"/>
+      </w:pPr>
+      <w:r>
+        <w:rPr>
+          <w:rFonts w:ascii="Calibri" w:hAnsi="Calibri"/>
+          <w:color w:val="000000"/>
+          <w:sz w:val="22"/>
+        </w:rPr>
+        <w:t>The firmware limit is -0.05 to +0.05 mm/mm. The wizard clamps the value to that range before sending it to GRBL.</w:t>
+      </w:r>
+    </w:p>
+    <w:p>
+      <w:pPr>
+        <w:keepLines/>
+        <w:spacing w:before="0" w:after="120" w:line="300" w:lineRule="auto"/>
+      </w:pPr>
+      <w:r>
+        <w:rPr>
+          <w:rFonts w:ascii="Calibri" w:hAnsi="Calibri"/>
+          <w:color w:val="000000"/>
+          <w:sz w:val="22"/>
+        </w:rPr>
+        <w:t>Do not run this wizard during an active job except for returning to it after the calibration cut has fully finished. Use the normal job controls to run the test program, then come back to the wizard for measurement entry and firmware update.</w:t>
       </w:r>
     </w:p>
     <w:p>
@@ -10408,7 +10739,70 @@
 </w:document>
 </file>
 
-<file path=word/footer1.xml><?xml version="1.0" encoding="utf-8"?>
+<file path=word\fontTable.xml><?xml version="1.0" encoding="utf-8"?>
+<w:fonts xmlns:mc="http://schemas.openxmlformats.org/markup-compatibility/2006" xmlns:r="http://schemas.openxmlformats.org/officeDocument/2006/relationships" xmlns:w="http://schemas.openxmlformats.org/wordprocessingml/2006/main" xmlns:w14="http://schemas.microsoft.com/office/word/2010/wordml" mc:Ignorable="w14">
+  <w:font w:name="Symbol">
+    <w:panose1 w:val="00000000000000000000"/>
+    <w:charset w:val="02"/>
+    <w:family w:val="auto"/>
+    <w:pitch w:val="variable"/>
+    <w:sig w:usb0="00000000" w:usb1="10000000" w:usb2="00000000" w:usb3="00000000" w:csb0="80000000" w:csb1="00000000"/>
+  </w:font>
+  <w:font w:name="Times New Roman">
+    <w:panose1 w:val="02020603050405020304"/>
+    <w:charset w:val="00"/>
+    <w:family w:val="auto"/>
+    <w:pitch w:val="variable"/>
+    <w:sig w:usb0="E0002AFF" w:usb1="C0007841" w:usb2="00000009" w:usb3="00000000" w:csb0="000001FF" w:csb1="00000000"/>
+  </w:font>
+  <w:font w:name="Cambria">
+    <w:panose1 w:val="02040503050406030204"/>
+    <w:charset w:val="00"/>
+    <w:family w:val="auto"/>
+    <w:pitch w:val="variable"/>
+    <w:sig w:usb0="E00002FF" w:usb1="400004FF" w:usb2="00000000" w:usb3="00000000" w:csb0="0000019F" w:csb1="00000000"/>
+  </w:font>
+  <w:font w:name="ＭＳ 明朝">
+    <w:panose1 w:val="00000000000000000000"/>
+    <w:charset w:val="80"/>
+    <w:family w:val="roman"/>
+    <w:notTrueType/>
+    <w:pitch w:val="fixed"/>
+    <w:sig w:usb0="00000001" w:usb1="08070000" w:usb2="00000010" w:usb3="00000000" w:csb0="00020000" w:csb1="00000000"/>
+  </w:font>
+  <w:font w:name="Calibri">
+    <w:panose1 w:val="020F0502020204030204"/>
+    <w:charset w:val="00"/>
+    <w:family w:val="auto"/>
+    <w:pitch w:val="variable"/>
+    <w:sig w:usb0="E10002FF" w:usb1="4000ACFF" w:usb2="00000009" w:usb3="00000000" w:csb0="0000019F" w:csb1="00000000"/>
+  </w:font>
+  <w:font w:name="ＭＳ ゴシック">
+    <w:panose1 w:val="00000000000000000000"/>
+    <w:charset w:val="80"/>
+    <w:family w:val="modern"/>
+    <w:notTrueType/>
+    <w:pitch w:val="fixed"/>
+    <w:sig w:usb0="00000001" w:usb1="08070000" w:usb2="00000010" w:usb3="00000000" w:csb0="00020000" w:csb1="00000000"/>
+  </w:font>
+  <w:font w:name="Courier">
+    <w:panose1 w:val="02000500000000000000"/>
+    <w:charset w:val="00"/>
+    <w:family w:val="auto"/>
+    <w:pitch w:val="variable"/>
+    <w:sig w:usb0="00000003" w:usb1="00000000" w:usb2="00000000" w:usb3="00000000" w:csb0="00000001" w:csb1="00000000"/>
+  </w:font>
+  <w:font w:name="Arial">
+    <w:panose1 w:val="020B0604020202020204"/>
+    <w:charset w:val="00"/>
+    <w:family w:val="auto"/>
+    <w:pitch w:val="variable"/>
+    <w:sig w:usb0="E0002AFF" w:usb1="C0007843" w:usb2="00000009" w:usb3="00000000" w:csb0="000001FF" w:csb1="00000000"/>
+  </w:font>
+</w:fonts>
+</file>
+
+<file path=word\footer1.xml><?xml version="1.0" encoding="utf-8"?>
 <w:ftr xmlns:m="http://schemas.openxmlformats.org/officeDocument/2006/math" xmlns:mc="http://schemas.openxmlformats.org/markup-compatibility/2006" xmlns:mo="http://schemas.microsoft.com/office/mac/office/2008/main" xmlns:mv="urn:schemas-microsoft-com:mac:vml" xmlns:o="urn:schemas-microsoft-com:office:office" xmlns:r="http://schemas.openxmlformats.org/officeDocument/2006/relationships" xmlns:v="urn:schemas-microsoft-com:vml" xmlns:w10="urn:schemas-microsoft-com:office:word" xmlns:w14="http://schemas.microsoft.com/office/word/2010/wordml" xmlns:w="http://schemas.openxmlformats.org/wordprocessingml/2006/main" xmlns:wne="http://schemas.microsoft.com/office/word/2006/wordml" xmlns:wp14="http://schemas.microsoft.com/office/word/2010/wordprocessingDrawing" xmlns:wp="http://schemas.openxmlformats.org/drawingml/2006/wordprocessingDrawing" xmlns:wpc="http://schemas.microsoft.com/office/word/2010/wordprocessingCanvas" xmlns:wpg="http://schemas.microsoft.com/office/word/2010/wordprocessingGroup" xmlns:wpi="http://schemas.microsoft.com/office/word/2010/wordprocessingInk" xmlns:wps="http://schemas.microsoft.com/office/word/2010/wordprocessingShape" mc:Ignorable="w14 wp14">
   <w:p>
     <w:pPr>
@@ -10427,7 +10821,7 @@
 </w:ftr>
 </file>
 
-<file path=word/header1.xml><?xml version="1.0" encoding="utf-8"?>
+<file path=word\header1.xml><?xml version="1.0" encoding="utf-8"?>
 <w:hdr xmlns:m="http://schemas.openxmlformats.org/officeDocument/2006/math" xmlns:mc="http://schemas.openxmlformats.org/markup-compatibility/2006" xmlns:mo="http://schemas.microsoft.com/office/mac/office/2008/main" xmlns:mv="urn:schemas-microsoft-com:mac:vml" xmlns:o="urn:schemas-microsoft-com:office:office" xmlns:r="http://schemas.openxmlformats.org/officeDocument/2006/relationships" xmlns:v="urn:schemas-microsoft-com:vml" xmlns:w10="urn:schemas-microsoft-com:office:word" xmlns:w14="http://schemas.microsoft.com/office/word/2010/wordml" xmlns:w="http://schemas.openxmlformats.org/wordprocessingml/2006/main" xmlns:wne="http://schemas.microsoft.com/office/word/2006/wordml" xmlns:wp14="http://schemas.microsoft.com/office/word/2010/wordprocessingDrawing" xmlns:wp="http://schemas.openxmlformats.org/drawingml/2006/wordprocessingDrawing" xmlns:wpc="http://schemas.microsoft.com/office/word/2010/wordprocessingCanvas" xmlns:wpg="http://schemas.microsoft.com/office/word/2010/wordprocessingGroup" xmlns:wpi="http://schemas.microsoft.com/office/word/2010/wordprocessingInk" xmlns:wps="http://schemas.microsoft.com/office/word/2010/wordprocessingShape" mc:Ignorable="w14 wp14">
   <w:p>
     <w:pPr>
@@ -10446,7 +10840,7 @@
 </w:hdr>
 </file>
 
-<file path=word/numbering.xml><?xml version="1.0" encoding="utf-8"?>
+<file path=word\numbering.xml><?xml version="1.0" encoding="utf-8"?>
 <w:numbering xmlns:wpc="http://schemas.microsoft.com/office/word/2010/wordprocessingCanvas" xmlns:mo="http://schemas.microsoft.com/office/mac/office/2008/main" xmlns:mc="http://schemas.openxmlformats.org/markup-compatibility/2006" xmlns:mv="urn:schemas-microsoft-com:mac:vml" xmlns:o="urn:schemas-microsoft-com:office:office" xmlns:r="http://schemas.openxmlformats.org/officeDocument/2006/relationships" xmlns:m="http://schemas.openxmlformats.org/officeDocument/2006/math" xmlns:v="urn:schemas-microsoft-com:vml" xmlns:wp14="http://schemas.microsoft.com/office/word/2010/wordprocessingDrawing" xmlns:wp="http://schemas.openxmlformats.org/drawingml/2006/wordprocessingDrawing" xmlns:w10="urn:schemas-microsoft-com:office:word" xmlns:w="http://schemas.openxmlformats.org/wordprocessingml/2006/main" xmlns:w14="http://schemas.microsoft.com/office/word/2010/wordml" xmlns:wpg="http://schemas.microsoft.com/office/word/2010/wordprocessingGroup" xmlns:wpi="http://schemas.microsoft.com/office/word/2010/wordprocessingInk" xmlns:wne="http://schemas.microsoft.com/office/word/2006/wordml" xmlns:wps="http://schemas.microsoft.com/office/word/2010/wordprocessingShape" mc:Ignorable="w14 wp14">
   <w:abstractNum w:abstractNumId="0">
     <w:nsid w:val="FFFFFF7C"/>
@@ -10649,7 +11043,62 @@
 </w:numbering>
 </file>
 
-<file path=word/styles.xml><?xml version="1.0" encoding="utf-8"?>
+<file path=word\settings.xml><?xml version="1.0" encoding="utf-8"?>
+<w:settings xmlns:mc="http://schemas.openxmlformats.org/markup-compatibility/2006" xmlns:o="urn:schemas-microsoft-com:office:office" xmlns:r="http://schemas.openxmlformats.org/officeDocument/2006/relationships" xmlns:m="http://schemas.openxmlformats.org/officeDocument/2006/math" xmlns:v="urn:schemas-microsoft-com:vml" xmlns:w10="urn:schemas-microsoft-com:office:word" xmlns:w="http://schemas.openxmlformats.org/wordprocessingml/2006/main" xmlns:w14="http://schemas.microsoft.com/office/word/2010/wordml" xmlns:sl="http://schemas.openxmlformats.org/schemaLibrary/2006/main" mc:Ignorable="w14">
+  <w:zoom w:val="bestFit"/>
+  <w:proofState w:spelling="clean" w:grammar="clean"/>
+  <w:defaultTabStop w:val="720"/>
+  <w:characterSpacingControl w:val="doNotCompress"/>
+  <w:savePreviewPicture/>
+  <w:compat>
+    <w:useFELayout/>
+    <w:compatSetting w:name="compatibilityMode" w:uri="http://schemas.microsoft.com/office/word" w:val="14"/>
+    <w:compatSetting w:name="overrideTableStyleFontSizeAndJustification" w:uri="http://schemas.microsoft.com/office/word" w:val="1"/>
+    <w:compatSetting w:name="enableOpenTypeFeatures" w:uri="http://schemas.microsoft.com/office/word" w:val="1"/>
+    <w:compatSetting w:name="doNotFlipMirrorIndents" w:uri="http://schemas.microsoft.com/office/word" w:val="1"/>
+  </w:compat>
+  <w:rsids>
+    <w:rsidRoot w:val="00B47730"/>
+    <w:rsid w:val="00034616"/>
+    <w:rsid w:val="0006063C"/>
+    <w:rsid w:val="0015074B"/>
+    <w:rsid w:val="0029639D"/>
+    <w:rsid w:val="00326F90"/>
+    <w:rsid w:val="00AA1D8D"/>
+    <w:rsid w:val="00B47730"/>
+    <w:rsid w:val="00CB0664"/>
+    <w:rsid w:val="00FC693F"/>
+  </w:rsids>
+  <m:mathPr>
+    <m:mathFont m:val="Cambria Math"/>
+    <m:brkBin m:val="before"/>
+    <m:brkBinSub m:val="--"/>
+    <m:smallFrac m:val="0"/>
+    <m:dispDef/>
+    <m:lMargin m:val="0"/>
+    <m:rMargin m:val="0"/>
+    <m:defJc m:val="centerGroup"/>
+    <m:wrapIndent m:val="1440"/>
+    <m:intLim m:val="subSup"/>
+    <m:naryLim m:val="undOvr"/>
+  </m:mathPr>
+  <w:themeFontLang w:val="en-US" w:eastAsia="ja-JP"/>
+  <w:clrSchemeMapping w:bg1="light1" w:t1="dark1" w:bg2="light2" w:t2="dark2" w:accent1="accent1" w:accent2="accent2" w:accent3="accent3" w:accent4="accent4" w:accent5="accent5" w:accent6="accent6" w:hyperlink="hyperlink" w:followedHyperlink="followedHyperlink"/>
+  <w:doNotAutoCompressPictures/>
+  <w:shapeDefaults>
+    <o:shapedefaults v:ext="edit" spidmax="1027"/>
+    <o:shapelayout v:ext="edit">
+      <o:idmap v:ext="edit" data="1"/>
+    </o:shapelayout>
+  </w:shapeDefaults>
+  <w:decimalSymbol w:val="."/>
+  <w:listSeparator w:val=","/>
+  <w14:docId w14:val="24062061"/>
+  <w14:defaultImageDpi w14:val="300"/>
+</w:settings>
+</file>
+
+<file path=word\styles.xml><?xml version="1.0" encoding="utf-8"?>
 <w:styles xmlns:mc="http://schemas.openxmlformats.org/markup-compatibility/2006" xmlns:r="http://schemas.openxmlformats.org/officeDocument/2006/relationships" xmlns:w="http://schemas.openxmlformats.org/wordprocessingml/2006/main" xmlns:w14="http://schemas.microsoft.com/office/word/2010/wordml" mc:Ignorable="w14">
   <w:docDefaults>
     <w:rPrDefault>
@@ -22531,7 +22980,7 @@
 </w:styles>
 </file>
 
-<file path=word/stylesWithEffects.xml><?xml version="1.0" encoding="utf-8"?>
+<file path=word\stylesWithEffects.xml><?xml version="1.0" encoding="utf-8"?>
 <w:styles xmlns:wpc="http://schemas.microsoft.com/office/word/2010/wordprocessingCanvas" xmlns:mo="http://schemas.microsoft.com/office/mac/office/2008/main" xmlns:mc="http://schemas.openxmlformats.org/markup-compatibility/2006" xmlns:mv="urn:schemas-microsoft-com:mac:vml" xmlns:o="urn:schemas-microsoft-com:office:office" xmlns:r="http://schemas.openxmlformats.org/officeDocument/2006/relationships" xmlns:m="http://schemas.openxmlformats.org/officeDocument/2006/math" xmlns:v="urn:schemas-microsoft-com:vml" xmlns:wp14="http://schemas.microsoft.com/office/word/2010/wordprocessingDrawing" xmlns:wp="http://schemas.openxmlformats.org/drawingml/2006/wordprocessingDrawing" xmlns:w10="urn:schemas-microsoft-com:office:word" xmlns:w="http://schemas.openxmlformats.org/wordprocessingml/2006/main" xmlns:w14="http://schemas.microsoft.com/office/word/2010/wordml" xmlns:wpg="http://schemas.microsoft.com/office/word/2010/wordprocessingGroup" xmlns:wpi="http://schemas.microsoft.com/office/word/2010/wordprocessingInk" xmlns:wne="http://schemas.microsoft.com/office/word/2006/wordml" xmlns:wps="http://schemas.microsoft.com/office/word/2010/wordprocessingShape" mc:Ignorable="w14 wp14">
   <w:docDefaults>
     <w:rPrDefault>
@@ -34333,7 +34782,7 @@
 </w:styles>
 </file>
 
-<file path=word/theme/theme1.xml><?xml version="1.0" encoding="utf-8"?>
+<file path=word\theme\theme1.xml><?xml version="1.0" encoding="utf-8"?>
 <a:theme xmlns:a="http://schemas.openxmlformats.org/drawingml/2006/main" name="Office Theme">
   <a:themeElements>
     <a:clrScheme name="Office">
@@ -34653,14 +35102,9 @@
 </a:theme>
 </file>
 
-<file path=customXml/item1.xml><?xml version="1.0" encoding="utf-8"?>
-<b:Sources xmlns:b="http://schemas.openxmlformats.org/officeDocument/2006/bibliography" xmlns="http://schemas.openxmlformats.org/officeDocument/2006/bibliography" SelectedStyle="/APA.XSL" StyleName="APA"/>
-</file>
-
-<file path=customXml/itemProps1.xml><?xml version="1.0" encoding="utf-8"?>
-<ds:datastoreItem xmlns:ds="http://schemas.openxmlformats.org/officeDocument/2006/customXml" ds:itemID="{EF278816-EC6F-A645-907D-7F25AECB1D4A}">
-  <ds:schemaRefs>
-    <ds:schemaRef ds:uri="http://schemas.openxmlformats.org/officeDocument/2006/bibliography"/>
-  </ds:schemaRefs>
-</ds:datastoreItem>
+<file path=word\webSettings.xml><?xml version="1.0" encoding="utf-8"?>
+<w:webSettings xmlns:mc="http://schemas.openxmlformats.org/markup-compatibility/2006" xmlns:r="http://schemas.openxmlformats.org/officeDocument/2006/relationships" xmlns:w="http://schemas.openxmlformats.org/wordprocessingml/2006/main" xmlns:w14="http://schemas.microsoft.com/office/word/2010/wordml" mc:Ignorable="w14">
+  <w:allowPNG/>
+  <w:doNotSaveAsSingleFile/>
+</w:webSettings>
 </file>
</xml_diff>